<commit_message>
Descripcion de la historia de js
</commit_message>
<xml_diff>
--- a/Investigación de JavaScript.docx
+++ b/Investigación de JavaScript.docx
@@ -2,7 +2,638 @@
 <file path=word/document.xml><?xml version="1.0" encoding="utf-8"?>
 <w:document xmlns:wpc="http://schemas.microsoft.com/office/word/2010/wordprocessingCanvas" xmlns:cx="http://schemas.microsoft.com/office/drawing/2014/chartex" xmlns:cx1="http://schemas.microsoft.com/office/drawing/2015/9/8/chartex" xmlns:cx2="http://schemas.microsoft.com/office/drawing/2015/10/21/chartex" xmlns:cx3="http://schemas.microsoft.com/office/drawing/2016/5/9/chartex" xmlns:cx4="http://schemas.microsoft.com/office/drawing/2016/5/10/chartex" xmlns:cx5="http://schemas.microsoft.com/office/drawing/2016/5/11/chartex" xmlns:cx6="http://schemas.microsoft.com/office/drawing/2016/5/12/chartex" xmlns:cx7="http://schemas.microsoft.com/office/drawing/2016/5/13/chartex" xmlns:cx8="http://schemas.microsoft.com/office/drawing/2016/5/14/chartex" xmlns:mc="http://schemas.openxmlformats.org/markup-compatibility/2006" xmlns:aink="http://schemas.microsoft.com/office/drawing/2016/ink" xmlns:am3d="http://schemas.microsoft.com/office/drawing/2017/model3d" xmlns:o="urn:schemas-microsoft-com:office:office" xmlns:oel="http://schemas.microsoft.com/office/2019/extlst" xmlns:r="http://schemas.openxmlformats.org/officeDocument/2006/relationships" xmlns:m="http://schemas.openxmlformats.org/officeDocument/2006/math" xmlns:v="urn:schemas-microsoft-com:vml" xmlns:wp14="http://schemas.microsoft.com/office/word/2010/wordprocessingDrawing" xmlns:wp="http://schemas.openxmlformats.org/drawingml/2006/wordprocessingDrawing" xmlns:w10="urn:schemas-microsoft-com:office:word" xmlns:w="http://schemas.openxmlformats.org/wordprocessingml/2006/main" xmlns:w14="http://schemas.microsoft.com/office/word/2010/wordml" xmlns:w15="http://schemas.microsoft.com/office/word/2012/wordml" xmlns:w16cex="http://schemas.microsoft.com/office/word/2018/wordml/cex" xmlns:w16cid="http://schemas.microsoft.com/office/word/2016/wordml/cid" xmlns:w16="http://schemas.microsoft.com/office/word/2018/wordml" xmlns:w16du="http://schemas.microsoft.com/office/word/2023/wordml/word16du" xmlns:w16sdtdh="http://schemas.microsoft.com/office/word/2020/wordml/sdtdatahash" xmlns:w16se="http://schemas.microsoft.com/office/word/2015/wordml/symex" xmlns:wpg="http://schemas.microsoft.com/office/word/2010/wordprocessingGroup" xmlns:wpi="http://schemas.microsoft.com/office/word/2010/wordprocessingInk" xmlns:wne="http://schemas.microsoft.com/office/word/2006/wordml" xmlns:wps="http://schemas.microsoft.com/office/word/2010/wordprocessingShape" mc:Ignorable="w14 w15 w16se w16cid w16 w16cex w16sdtdh w16du wp14">
   <w:body>
+    <w:p>
+      <w:pPr>
+        <w:pStyle w:val="Ttulo1"/>
+        <w:jc w:val="center"/>
+        <w:rPr>
+          <w:rFonts w:ascii="Cascadia Code" w:hAnsi="Cascadia Code" w:cs="Cascadia Code"/>
+          <w:b/>
+          <w:bCs/>
+          <w:sz w:val="72"/>
+          <w:szCs w:val="72"/>
+          <w:u w:val="single"/>
+        </w:rPr>
+      </w:pPr>
+      <w:r>
+        <w:rPr>
+          <w:rFonts w:ascii="Cascadia Code" w:hAnsi="Cascadia Code" w:cs="Cascadia Code"/>
+          <w:b/>
+          <w:bCs/>
+          <w:sz w:val="72"/>
+          <w:szCs w:val="72"/>
+          <w:u w:val="single"/>
+        </w:rPr>
+        <w:t>historia de JavaScript</w:t>
+      </w:r>
+    </w:p>
     <w:p/>
+    <w:p>
+      <w:pPr>
+        <w:jc w:val="both"/>
+        <w:rPr>
+          <w:rFonts w:ascii="Cascadia Code" w:hAnsi="Cascadia Code" w:cs="Cascadia Code"/>
+          <w:b/>
+          <w:bCs/>
+        </w:rPr>
+      </w:pPr>
+      <w:r>
+        <w:rPr>
+          <w:rFonts w:ascii="Cascadia Code" w:hAnsi="Cascadia Code" w:cs="Cascadia Code"/>
+        </w:rPr>
+        <w:t>JavaScript es uno de los lenguajes más populares en el mundo y durante la década del 2010 al 2020, fue el número uno sobre la tierra y se apoderó de casi todas las industrias del desarrollo de software. Todo se hacía con JavaScript e incluso, llegó a hablarse de la </w:t>
+      </w:r>
+      <w:r>
+        <w:rPr>
+          <w:rFonts w:ascii="Cascadia Code" w:hAnsi="Cascadia Code" w:cs="Cascadia Code"/>
+          <w:b/>
+          <w:bCs/>
+          <w:i/>
+          <w:iCs/>
+        </w:rPr>
+        <w:t>fatiga JavaScript</w:t>
+      </w:r>
+      <w:r>
+        <w:rPr>
+          <w:rFonts w:ascii="Cascadia Code" w:hAnsi="Cascadia Code" w:cs="Cascadia Code"/>
+          <w:b/>
+          <w:bCs/>
+        </w:rPr>
+        <w:t>.</w:t>
+      </w:r>
+    </w:p>
+    <w:p>
+      <w:pPr>
+        <w:jc w:val="both"/>
+        <w:rPr>
+          <w:rFonts w:ascii="Cascadia Code" w:hAnsi="Cascadia Code" w:cs="Cascadia Code"/>
+          <w:b/>
+          <w:bCs/>
+        </w:rPr>
+      </w:pPr>
+    </w:p>
+    <w:p>
+      <w:pPr>
+        <w:jc w:val="both"/>
+        <w:rPr>
+          <w:rFonts w:ascii="Cascadia Code" w:hAnsi="Cascadia Code" w:cs="Cascadia Code"/>
+          <w:b/>
+          <w:bCs/>
+          <w:i/>
+          <w:iCs/>
+          <w:color w:val="595959" w:themeColor="text1" w:themeTint="A6"/>
+          <w:sz w:val="36"/>
+          <w:szCs w:val="36"/>
+          <w:u w:val="single"/>
+        </w:rPr>
+      </w:pPr>
+      <w:r>
+        <w:rPr>
+          <w:rFonts w:ascii="Cascadia Code" w:hAnsi="Cascadia Code" w:cs="Cascadia Code"/>
+          <w:b/>
+          <w:bCs/>
+          <w:i/>
+          <w:iCs/>
+          <w:color w:val="595959" w:themeColor="text1" w:themeTint="A6"/>
+          <w:sz w:val="36"/>
+          <w:szCs w:val="36"/>
+          <w:u w:val="single"/>
+        </w:rPr>
+        <w:t>Historia y evolución:</w:t>
+      </w:r>
+    </w:p>
+    <w:p>
+      <w:pPr>
+        <w:jc w:val="both"/>
+        <w:rPr>
+          <w:rFonts w:ascii="Cascadia Code" w:hAnsi="Cascadia Code" w:cs="Cascadia Code"/>
+          <w:b/>
+          <w:bCs/>
+        </w:rPr>
+      </w:pPr>
+    </w:p>
+    <w:p>
+      <w:pPr>
+        <w:jc w:val="both"/>
+        <w:rPr>
+          <w:rFonts w:ascii="Cascadia Code" w:hAnsi="Cascadia Code" w:cs="Cascadia Code"/>
+        </w:rPr>
+      </w:pPr>
+      <w:r>
+        <w:rPr>
+          <w:rFonts w:ascii="Cascadia Code" w:hAnsi="Cascadia Code" w:cs="Cascadia Code"/>
+        </w:rPr>
+        <w:t xml:space="preserve">La evolución de JavaScript y del ecosistema web moderno está estrechamente ligada al desarrollo de los navegadores y a la necesidad de hacer la web más interactiva, escalable y estandarizada. A mediados de los años noventa, </w:t>
+      </w:r>
+      <w:r>
+        <w:rPr>
+          <w:rFonts w:ascii="Cascadia Code" w:hAnsi="Cascadia Code" w:cs="Cascadia Code"/>
+          <w:b/>
+          <w:bCs/>
+        </w:rPr>
+        <w:t xml:space="preserve">Netscape </w:t>
+      </w:r>
+      <w:proofErr w:type="spellStart"/>
+      <w:r>
+        <w:rPr>
+          <w:rFonts w:ascii="Cascadia Code" w:hAnsi="Cascadia Code" w:cs="Cascadia Code"/>
+          <w:b/>
+          <w:bCs/>
+        </w:rPr>
+        <w:t>Navigator</w:t>
+      </w:r>
+      <w:proofErr w:type="spellEnd"/>
+      <w:r>
+        <w:rPr>
+          <w:rFonts w:ascii="Cascadia Code" w:hAnsi="Cascadia Code" w:cs="Cascadia Code"/>
+        </w:rPr>
+        <w:t xml:space="preserve"> impulsó la adopción masiva de la web gráfica y, en 1995, Brendan </w:t>
+      </w:r>
+      <w:proofErr w:type="spellStart"/>
+      <w:r>
+        <w:rPr>
+          <w:rFonts w:ascii="Cascadia Code" w:hAnsi="Cascadia Code" w:cs="Cascadia Code"/>
+        </w:rPr>
+        <w:t>Eich</w:t>
+      </w:r>
+      <w:proofErr w:type="spellEnd"/>
+      <w:r>
+        <w:rPr>
+          <w:rFonts w:ascii="Cascadia Code" w:hAnsi="Cascadia Code" w:cs="Cascadia Code"/>
+        </w:rPr>
+        <w:t xml:space="preserve"> creó JavaScript como un lenguaje ligero para añadir interactividad a documentos HTML. Aunque su nombre se eligió por razones de marketing, JavaScript nació con un enfoque práctico y accesible, lo que facilitó su rápida adopción. La aparición de </w:t>
+      </w:r>
+      <w:proofErr w:type="spellStart"/>
+      <w:r>
+        <w:rPr>
+          <w:rFonts w:ascii="Cascadia Code" w:hAnsi="Cascadia Code" w:cs="Cascadia Code"/>
+          <w:b/>
+          <w:bCs/>
+        </w:rPr>
+        <w:t>JScript</w:t>
+      </w:r>
+      <w:proofErr w:type="spellEnd"/>
+      <w:r>
+        <w:rPr>
+          <w:rFonts w:ascii="Cascadia Code" w:hAnsi="Cascadia Code" w:cs="Cascadia Code"/>
+        </w:rPr>
+        <w:t xml:space="preserve"> por parte de Microsoft y la competencia entre navegadores provocaron incompatibilidades que evidenciaron la necesidad de un estándar común.</w:t>
+      </w:r>
+    </w:p>
+    <w:p>
+      <w:pPr>
+        <w:jc w:val="both"/>
+        <w:rPr>
+          <w:rFonts w:ascii="Cascadia Code" w:hAnsi="Cascadia Code" w:cs="Cascadia Code"/>
+        </w:rPr>
+      </w:pPr>
+      <w:r>
+        <w:rPr>
+          <w:rFonts w:ascii="Cascadia Code" w:hAnsi="Cascadia Code" w:cs="Cascadia Code"/>
+        </w:rPr>
+        <w:t xml:space="preserve">Para resolver esta fragmentación, JavaScript fue enviado a </w:t>
+      </w:r>
+      <w:r>
+        <w:rPr>
+          <w:rFonts w:ascii="Cascadia Code" w:hAnsi="Cascadia Code" w:cs="Cascadia Code"/>
+          <w:b/>
+          <w:bCs/>
+        </w:rPr>
+        <w:t>ECMA International</w:t>
+      </w:r>
+      <w:r>
+        <w:rPr>
+          <w:rFonts w:ascii="Cascadia Code" w:hAnsi="Cascadia Code" w:cs="Cascadia Code"/>
+        </w:rPr>
+        <w:t xml:space="preserve">, dando lugar a </w:t>
+      </w:r>
+      <w:r>
+        <w:rPr>
+          <w:rFonts w:ascii="Cascadia Code" w:hAnsi="Cascadia Code" w:cs="Cascadia Code"/>
+          <w:b/>
+          <w:bCs/>
+        </w:rPr>
+        <w:t>ECMAScript</w:t>
+      </w:r>
+      <w:r>
+        <w:rPr>
+          <w:rFonts w:ascii="Cascadia Code" w:hAnsi="Cascadia Code" w:cs="Cascadia Code"/>
+        </w:rPr>
+        <w:t>, una especificación independiente de los fabricantes. Con ECMAScript 3, publicado en 1999, el lenguaje incorporó características fundamentales como manejo de excepciones, expresiones regulares y nuevos métodos de cadenas, consolidándose como una herramienta viable para el desarrollo web profesional. Paralelamente, el declive de Netscape y la liberación del código del navegador impulsaron el proyecto Mozilla, que fomentó el uso de estándares abiertos y sentó las bases para navegadores modernos como Firefox.</w:t>
+      </w:r>
+    </w:p>
+    <w:p>
+      <w:pPr>
+        <w:jc w:val="both"/>
+        <w:rPr>
+          <w:rFonts w:ascii="Cascadia Code" w:hAnsi="Cascadia Code" w:cs="Cascadia Code"/>
+        </w:rPr>
+      </w:pPr>
+      <w:r>
+        <w:rPr>
+          <w:rFonts w:ascii="Cascadia Code" w:hAnsi="Cascadia Code" w:cs="Cascadia Code"/>
+        </w:rPr>
+        <w:lastRenderedPageBreak/>
+        <w:t xml:space="preserve">A principios de los años 2000, la introducción de técnicas asíncronas mediante </w:t>
+      </w:r>
+      <w:proofErr w:type="spellStart"/>
+      <w:r>
+        <w:rPr>
+          <w:rFonts w:ascii="Cascadia Code" w:hAnsi="Cascadia Code" w:cs="Cascadia Code"/>
+          <w:b/>
+          <w:bCs/>
+        </w:rPr>
+        <w:t>XMLHttpRequest</w:t>
+      </w:r>
+      <w:proofErr w:type="spellEnd"/>
+      <w:r>
+        <w:rPr>
+          <w:rFonts w:ascii="Cascadia Code" w:hAnsi="Cascadia Code" w:cs="Cascadia Code"/>
+        </w:rPr>
+        <w:t xml:space="preserve"> y, posteriormente, AJAX, transformó el desarrollo web. Aplicaciones como Gmail demostraron que era posible crear interfaces altamente dinámicas y responsivas sin recargar la página, dando origen a la llamada </w:t>
+      </w:r>
+      <w:r>
+        <w:rPr>
+          <w:rFonts w:ascii="Cascadia Code" w:hAnsi="Cascadia Code" w:cs="Cascadia Code"/>
+          <w:b/>
+          <w:bCs/>
+          <w:color w:val="0D0D0D" w:themeColor="text1" w:themeTint="F2"/>
+        </w:rPr>
+        <w:t>Web 2.0.</w:t>
+      </w:r>
+      <w:r>
+        <w:rPr>
+          <w:rFonts w:ascii="Cascadia Code" w:hAnsi="Cascadia Code" w:cs="Cascadia Code"/>
+          <w:color w:val="0D0D0D" w:themeColor="text1" w:themeTint="F2"/>
+        </w:rPr>
+        <w:t xml:space="preserve"> </w:t>
+      </w:r>
+      <w:r>
+        <w:rPr>
+          <w:rFonts w:ascii="Cascadia Code" w:hAnsi="Cascadia Code" w:cs="Cascadia Code"/>
+        </w:rPr>
+        <w:t>En este contexto surgieron bibliotecas como jQuery, que simplificaron la manipulación del DOM y resolvieron problemas de compatibilidad entre navegadores, además de recursos fundamentales como MDN, que unificaron y estandarizaron la documentación para desarrolladores.</w:t>
+      </w:r>
+    </w:p>
+    <w:p>
+      <w:pPr>
+        <w:jc w:val="both"/>
+        <w:rPr>
+          <w:rFonts w:ascii="Cascadia Code" w:hAnsi="Cascadia Code" w:cs="Cascadia Code"/>
+        </w:rPr>
+      </w:pPr>
+      <w:r>
+        <w:rPr>
+          <w:rFonts w:ascii="Cascadia Code" w:hAnsi="Cascadia Code" w:cs="Cascadia Code"/>
+        </w:rPr>
+        <w:t xml:space="preserve">El lanzamiento de Google Chrome y su motor V8 en 2008 marcó un punto de inflexión en el rendimiento de JavaScript, al introducir compilación justo a tiempo y una ejecución mucho más rápida. Estas innovaciones hicieron posible la expansión del lenguaje más allá del navegador con la llegada de </w:t>
+      </w:r>
+      <w:r>
+        <w:rPr>
+          <w:rFonts w:ascii="Cascadia Code" w:hAnsi="Cascadia Code" w:cs="Cascadia Code"/>
+          <w:b/>
+          <w:bCs/>
+        </w:rPr>
+        <w:t>Node.js</w:t>
+      </w:r>
+      <w:r>
+        <w:rPr>
+          <w:rFonts w:ascii="Cascadia Code" w:hAnsi="Cascadia Code" w:cs="Cascadia Code"/>
+        </w:rPr>
+        <w:t xml:space="preserve">, que permitió utilizar JavaScript del lado del servidor y consolidó el </w:t>
+      </w:r>
+      <w:r>
+        <w:rPr>
+          <w:rFonts w:ascii="Cascadia Code" w:hAnsi="Cascadia Code" w:cs="Cascadia Code"/>
+          <w:b/>
+          <w:bCs/>
+          <w:color w:val="0D0D0D" w:themeColor="text1" w:themeTint="F2"/>
+        </w:rPr>
+        <w:t>desarrollo full-</w:t>
+      </w:r>
+      <w:proofErr w:type="spellStart"/>
+      <w:r>
+        <w:rPr>
+          <w:rFonts w:ascii="Cascadia Code" w:hAnsi="Cascadia Code" w:cs="Cascadia Code"/>
+          <w:b/>
+          <w:bCs/>
+          <w:color w:val="0D0D0D" w:themeColor="text1" w:themeTint="F2"/>
+        </w:rPr>
+        <w:t>stack</w:t>
+      </w:r>
+      <w:proofErr w:type="spellEnd"/>
+      <w:r>
+        <w:rPr>
+          <w:rFonts w:ascii="Cascadia Code" w:hAnsi="Cascadia Code" w:cs="Cascadia Code"/>
+          <w:b/>
+          <w:bCs/>
+          <w:color w:val="0D0D0D" w:themeColor="text1" w:themeTint="F2"/>
+        </w:rPr>
+        <w:t xml:space="preserve"> </w:t>
+      </w:r>
+      <w:r>
+        <w:rPr>
+          <w:rFonts w:ascii="Cascadia Code" w:hAnsi="Cascadia Code" w:cs="Cascadia Code"/>
+          <w:b/>
+          <w:bCs/>
+        </w:rPr>
+        <w:t>con un único lenguaje</w:t>
+      </w:r>
+      <w:r>
+        <w:rPr>
+          <w:rFonts w:ascii="Cascadia Code" w:hAnsi="Cascadia Code" w:cs="Cascadia Code"/>
+        </w:rPr>
+        <w:t xml:space="preserve">. A partir de este momento, el ecosistema comenzó a crecer rápidamente, con la aparición de gestores de paquetes como </w:t>
+      </w:r>
+      <w:proofErr w:type="spellStart"/>
+      <w:r>
+        <w:rPr>
+          <w:rFonts w:ascii="Cascadia Code" w:hAnsi="Cascadia Code" w:cs="Cascadia Code"/>
+          <w:b/>
+          <w:bCs/>
+        </w:rPr>
+        <w:t>npm</w:t>
+      </w:r>
+      <w:proofErr w:type="spellEnd"/>
+      <w:r>
+        <w:rPr>
+          <w:rFonts w:ascii="Cascadia Code" w:hAnsi="Cascadia Code" w:cs="Cascadia Code"/>
+          <w:b/>
+          <w:bCs/>
+        </w:rPr>
+        <w:t xml:space="preserve">, </w:t>
+      </w:r>
+      <w:proofErr w:type="spellStart"/>
+      <w:r>
+        <w:rPr>
+          <w:rFonts w:ascii="Cascadia Code" w:hAnsi="Cascadia Code" w:cs="Cascadia Code"/>
+          <w:b/>
+          <w:bCs/>
+        </w:rPr>
+        <w:t>frameworks</w:t>
+      </w:r>
+      <w:proofErr w:type="spellEnd"/>
+      <w:r>
+        <w:rPr>
+          <w:rFonts w:ascii="Cascadia Code" w:hAnsi="Cascadia Code" w:cs="Cascadia Code"/>
+          <w:b/>
+          <w:bCs/>
+        </w:rPr>
+        <w:t xml:space="preserve"> </w:t>
+      </w:r>
+      <w:proofErr w:type="spellStart"/>
+      <w:r>
+        <w:rPr>
+          <w:rFonts w:ascii="Cascadia Code" w:hAnsi="Cascadia Code" w:cs="Cascadia Code"/>
+          <w:b/>
+          <w:bCs/>
+        </w:rPr>
+        <w:t>backend</w:t>
+      </w:r>
+      <w:proofErr w:type="spellEnd"/>
+      <w:r>
+        <w:rPr>
+          <w:rFonts w:ascii="Cascadia Code" w:hAnsi="Cascadia Code" w:cs="Cascadia Code"/>
+          <w:b/>
+          <w:bCs/>
+        </w:rPr>
+        <w:t xml:space="preserve"> como Express y nuevas formas de modularizar el código.</w:t>
+      </w:r>
+    </w:p>
+    <w:p>
+      <w:pPr>
+        <w:jc w:val="both"/>
+        <w:rPr>
+          <w:rFonts w:ascii="Cascadia Code" w:hAnsi="Cascadia Code" w:cs="Cascadia Code"/>
+        </w:rPr>
+      </w:pPr>
+      <w:r>
+        <w:rPr>
+          <w:rFonts w:ascii="Cascadia Code" w:hAnsi="Cascadia Code" w:cs="Cascadia Code"/>
+        </w:rPr>
+        <w:t xml:space="preserve">Durante la década de 2010, JavaScript alcanzó un alto grado de madurez. </w:t>
+      </w:r>
+      <w:proofErr w:type="spellStart"/>
+      <w:r>
+        <w:rPr>
+          <w:rFonts w:ascii="Cascadia Code" w:hAnsi="Cascadia Code" w:cs="Cascadia Code"/>
+        </w:rPr>
+        <w:t>Frameworks</w:t>
+      </w:r>
+      <w:proofErr w:type="spellEnd"/>
+      <w:r>
+        <w:rPr>
+          <w:rFonts w:ascii="Cascadia Code" w:hAnsi="Cascadia Code" w:cs="Cascadia Code"/>
+        </w:rPr>
+        <w:t xml:space="preserve"> y bibliotecas como </w:t>
+      </w:r>
+      <w:r>
+        <w:rPr>
+          <w:rFonts w:ascii="Cascadia Code" w:hAnsi="Cascadia Code" w:cs="Cascadia Code"/>
+          <w:b/>
+          <w:bCs/>
+        </w:rPr>
+        <w:t xml:space="preserve">Angular, </w:t>
+      </w:r>
+      <w:proofErr w:type="spellStart"/>
+      <w:r>
+        <w:rPr>
+          <w:rFonts w:ascii="Cascadia Code" w:hAnsi="Cascadia Code" w:cs="Cascadia Code"/>
+          <w:b/>
+          <w:bCs/>
+        </w:rPr>
+        <w:t>React</w:t>
+      </w:r>
+      <w:proofErr w:type="spellEnd"/>
+      <w:r>
+        <w:rPr>
+          <w:rFonts w:ascii="Cascadia Code" w:hAnsi="Cascadia Code" w:cs="Cascadia Code"/>
+          <w:b/>
+          <w:bCs/>
+        </w:rPr>
+        <w:t xml:space="preserve"> y </w:t>
+      </w:r>
+      <w:proofErr w:type="spellStart"/>
+      <w:r>
+        <w:rPr>
+          <w:rFonts w:ascii="Cascadia Code" w:hAnsi="Cascadia Code" w:cs="Cascadia Code"/>
+          <w:b/>
+          <w:bCs/>
+        </w:rPr>
+        <w:t>Vue</w:t>
+      </w:r>
+      <w:proofErr w:type="spellEnd"/>
+      <w:r>
+        <w:rPr>
+          <w:rFonts w:ascii="Cascadia Code" w:hAnsi="Cascadia Code" w:cs="Cascadia Code"/>
+        </w:rPr>
+        <w:t xml:space="preserve"> redefinieron la creación de interfaces de usuario mediante arquitecturas basadas en componentes. Herramientas como </w:t>
+      </w:r>
+      <w:proofErr w:type="spellStart"/>
+      <w:r>
+        <w:rPr>
+          <w:rFonts w:ascii="Cascadia Code" w:hAnsi="Cascadia Code" w:cs="Cascadia Code"/>
+          <w:b/>
+          <w:bCs/>
+        </w:rPr>
+        <w:t>Webpack</w:t>
+      </w:r>
+      <w:proofErr w:type="spellEnd"/>
+      <w:r>
+        <w:rPr>
+          <w:rFonts w:ascii="Cascadia Code" w:hAnsi="Cascadia Code" w:cs="Cascadia Code"/>
+        </w:rPr>
+        <w:t xml:space="preserve">, </w:t>
+      </w:r>
+      <w:r>
+        <w:rPr>
+          <w:rFonts w:ascii="Cascadia Code" w:hAnsi="Cascadia Code" w:cs="Cascadia Code"/>
+          <w:b/>
+          <w:bCs/>
+        </w:rPr>
+        <w:t>Babel</w:t>
+      </w:r>
+      <w:r>
+        <w:rPr>
+          <w:rFonts w:ascii="Cascadia Code" w:hAnsi="Cascadia Code" w:cs="Cascadia Code"/>
+        </w:rPr>
+        <w:t xml:space="preserve"> y </w:t>
+      </w:r>
+      <w:proofErr w:type="spellStart"/>
+      <w:r>
+        <w:rPr>
+          <w:rFonts w:ascii="Cascadia Code" w:hAnsi="Cascadia Code" w:cs="Cascadia Code"/>
+          <w:b/>
+          <w:bCs/>
+        </w:rPr>
+        <w:t>TypeScript</w:t>
+      </w:r>
+      <w:proofErr w:type="spellEnd"/>
+      <w:r>
+        <w:rPr>
+          <w:rFonts w:ascii="Cascadia Code" w:hAnsi="Cascadia Code" w:cs="Cascadia Code"/>
+        </w:rPr>
+        <w:t xml:space="preserve"> mejoraron la escalabilidad, el mantenimiento y la compatibilidad del código, facilitando el desarrollo de aplicaciones complejas a nivel empresarial. Al mismo tiempo, el lenguaje se expandió a otros entornos, incluyendo aplicaciones de escritorio mediante </w:t>
+      </w:r>
+      <w:proofErr w:type="spellStart"/>
+      <w:r>
+        <w:rPr>
+          <w:rFonts w:ascii="Cascadia Code" w:hAnsi="Cascadia Code" w:cs="Cascadia Code"/>
+          <w:b/>
+          <w:bCs/>
+        </w:rPr>
+        <w:t>Electron</w:t>
+      </w:r>
+      <w:proofErr w:type="spellEnd"/>
+      <w:r>
+        <w:rPr>
+          <w:rFonts w:ascii="Cascadia Code" w:hAnsi="Cascadia Code" w:cs="Cascadia Code"/>
+        </w:rPr>
+        <w:t xml:space="preserve"> y arquitecturas sin servidor impulsadas por plataformas en la nube.</w:t>
+      </w:r>
+    </w:p>
+    <w:p>
+      <w:pPr>
+        <w:jc w:val="both"/>
+        <w:rPr>
+          <w:rFonts w:ascii="Cascadia Code" w:hAnsi="Cascadia Code" w:cs="Cascadia Code"/>
+        </w:rPr>
+      </w:pPr>
+      <w:r>
+        <w:rPr>
+          <w:rFonts w:ascii="Cascadia Code" w:hAnsi="Cascadia Code" w:cs="Cascadia Code"/>
+        </w:rPr>
+        <w:t xml:space="preserve">En los últimos años, el ecosistema ha continuado evolucionando hacia un mayor rendimiento, seguridad y estandarización. Nuevos entornos de ejecución como </w:t>
+      </w:r>
+      <w:proofErr w:type="spellStart"/>
+      <w:r>
+        <w:rPr>
+          <w:rFonts w:ascii="Cascadia Code" w:hAnsi="Cascadia Code" w:cs="Cascadia Code"/>
+          <w:b/>
+          <w:bCs/>
+        </w:rPr>
+        <w:t>Deno</w:t>
+      </w:r>
+      <w:proofErr w:type="spellEnd"/>
+      <w:r>
+        <w:rPr>
+          <w:rFonts w:ascii="Cascadia Code" w:hAnsi="Cascadia Code" w:cs="Cascadia Code"/>
+          <w:b/>
+          <w:bCs/>
+        </w:rPr>
+        <w:t xml:space="preserve"> y </w:t>
+      </w:r>
+      <w:proofErr w:type="spellStart"/>
+      <w:r>
+        <w:rPr>
+          <w:rFonts w:ascii="Cascadia Code" w:hAnsi="Cascadia Code" w:cs="Cascadia Code"/>
+          <w:b/>
+          <w:bCs/>
+        </w:rPr>
+        <w:t>Bun</w:t>
+      </w:r>
+      <w:proofErr w:type="spellEnd"/>
+      <w:r>
+        <w:rPr>
+          <w:rFonts w:ascii="Cascadia Code" w:hAnsi="Cascadia Code" w:cs="Cascadia Code"/>
+        </w:rPr>
+        <w:t xml:space="preserve"> proponen alternativas modernas a </w:t>
+      </w:r>
+      <w:r>
+        <w:rPr>
+          <w:rFonts w:ascii="Cascadia Code" w:hAnsi="Cascadia Code" w:cs="Cascadia Code"/>
+          <w:b/>
+          <w:bCs/>
+        </w:rPr>
+        <w:t xml:space="preserve">Node.js, </w:t>
+      </w:r>
+      <w:r>
+        <w:rPr>
+          <w:rFonts w:ascii="Cascadia Code" w:hAnsi="Cascadia Code" w:cs="Cascadia Code"/>
+        </w:rPr>
+        <w:t xml:space="preserve">mientras que </w:t>
+      </w:r>
+      <w:r>
+        <w:rPr>
+          <w:rFonts w:ascii="Cascadia Code" w:hAnsi="Cascadia Code" w:cs="Cascadia Code"/>
+          <w:b/>
+          <w:bCs/>
+        </w:rPr>
+        <w:t>ECMAScript</w:t>
+      </w:r>
+      <w:r>
+        <w:rPr>
+          <w:rFonts w:ascii="Cascadia Code" w:hAnsi="Cascadia Code" w:cs="Cascadia Code"/>
+        </w:rPr>
+        <w:t xml:space="preserve"> mantiene un ciclo de actualizaciones anual que introduce mejoras constantes. El retiro definitivo de tecno</w:t>
+      </w:r>
+      <w:r>
+        <w:rPr>
+          <w:rFonts w:ascii="Cascadia Code" w:hAnsi="Cascadia Code" w:cs="Cascadia Code"/>
+        </w:rPr>
+        <w:lastRenderedPageBreak/>
+        <w:t xml:space="preserve">logías obsoletas como </w:t>
+      </w:r>
+      <w:r>
+        <w:rPr>
+          <w:rFonts w:ascii="Cascadia Code" w:hAnsi="Cascadia Code" w:cs="Cascadia Code"/>
+          <w:b/>
+          <w:bCs/>
+        </w:rPr>
+        <w:t>Flash e Internet</w:t>
+      </w:r>
+      <w:r>
+        <w:rPr>
+          <w:rFonts w:ascii="Cascadia Code" w:hAnsi="Cascadia Code" w:cs="Cascadia Code"/>
+        </w:rPr>
+        <w:t xml:space="preserve"> Explorer simboliza la consolidación de una web moderna, basada en estándares abiertos. Actualmente, JavaScript se mantiene como uno de los lenguajes más influyentes del mundo, con presencia en navegadores, servidores, aplicaciones de escritorio, computación en el borde e incluso sistemas aeroespaciales, y su desarrollo sigue siendo impulsado por una comunidad global y un ecosistema en constante transformación.</w:t>
+      </w:r>
+    </w:p>
+    <w:p>
+      <w:pPr>
+        <w:jc w:val="both"/>
+      </w:pPr>
+    </w:p>
     <w:sectPr>
       <w:pgSz w:w="12240" w:h="15840"/>
       <w:pgMar w:top="1417" w:right="1701" w:bottom="1417" w:left="1701" w:header="708" w:footer="708" w:gutter="0"/>
@@ -616,7 +1247,6 @@
   <w:style w:type="character" w:default="1" w:styleId="Fuentedeprrafopredeter">
     <w:name w:val="Default Paragraph Font"/>
     <w:uiPriority w:val="1"/>
-    <w:semiHidden/>
     <w:unhideWhenUsed/>
   </w:style>
   <w:style w:type="table" w:default="1" w:styleId="Tablanormal">
@@ -928,6 +1558,29 @@
       <w:smallCaps/>
       <w:color w:val="0F4761" w:themeColor="accent1" w:themeShade="BF"/>
       <w:spacing w:val="5"/>
+    </w:rPr>
+  </w:style>
+  <w:style w:type="character" w:styleId="Hipervnculo">
+    <w:name w:val="Hyperlink"/>
+    <w:basedOn w:val="Fuentedeprrafopredeter"/>
+    <w:uiPriority w:val="99"/>
+    <w:unhideWhenUsed/>
+    <w:rsid w:val="000006BC"/>
+    <w:rPr>
+      <w:color w:val="467886" w:themeColor="hyperlink"/>
+      <w:u w:val="single"/>
+    </w:rPr>
+  </w:style>
+  <w:style w:type="character" w:styleId="Mencinsinresolver">
+    <w:name w:val="Unresolved Mention"/>
+    <w:basedOn w:val="Fuentedeprrafopredeter"/>
+    <w:uiPriority w:val="99"/>
+    <w:semiHidden/>
+    <w:unhideWhenUsed/>
+    <w:rsid w:val="000006BC"/>
+    <w:rPr>
+      <w:color w:val="605E5C"/>
+      <w:shd w:val="clear" w:color="auto" w:fill="E1DFDD"/>
     </w:rPr>
   </w:style>
 </w:styles>

</xml_diff>